<commit_message>
Sync research festival names, current docs and export manifests
</commit_message>
<xml_diff>
--- a/public/thesis-library/purple/island-plan/proposal.docx
+++ b/public/thesis-library/purple/island-plan/proposal.docx
@@ -7,12 +7,17 @@
         <w:pStyle w:val="Title"/>
       </w:pPr>
       <w:r>
-        <w:t>論文智能島設計與模型分工</w:t>
+        <w:t>研究同樂會 現行設計與功能說明</w:t>
       </w:r>
     </w:p>
     <w:p>
       <w:r>
-        <w:t>2026-10-23｜給 Tarshar｜知臨整理，Claude 獨立評估並交叉覆核</w:t>
+        <w:t>2026年10月26日更新</w:t>
+      </w:r>
+    </w:p>
+    <w:p>
+      <w:r>
+        <w:t>Tarshar 的研究同樂會是一座連續草地園區，有五個展區與十五個研究攤位。可自由探索，也可讓 Tarshar 沿步道帶路；研究內容提供工作稿與來源入口。</w:t>
       </w:r>
     </w:p>
     <w:p>
@@ -20,853 +25,7 @@
         <w:pStyle w:val="Heading1"/>
       </w:pPr>
       <w:r>
-        <w:t>建議與本輪狀態</w:t>
-      </w:r>
-    </w:p>
-    <w:p>
-      <w:r>
-        <w:t>建議做「可愛的論文工作入口」：以五座黏土風六角島，把現在做哪裡、資料在哪裡、下一步做什麼放在一起。實驗島再展開 A／B 的運作流程。沿用現有紫區平台與共同大腦，新增一層視覺入口。</w:t>
-      </w:r>
-    </w:p>
-    <w:p>
-      <w:r>
-        <w:t>同步時另查得 vault da97926 的最新公開決定；以下已對齊文件公開、主機仍私人連線。</w:t>
-      </w:r>
-    </w:p>
-    <w:p>
-      <w:r>
-        <w:t>本輪完成需求查核、實際 Claude 評估、模型官方資料查核與可開工規格。這是研究提案；尚未建置智能島、部署、測手機效能或做模型比較。預設以每天推進論文為主，保留切換查看 AI 運作的入口；這是目前推薦，不冒充本人已選定首頁優先序。</w:t>
-      </w:r>
-    </w:p>
-    <w:p>
-      <w:pPr>
-        <w:pStyle w:val="Heading1"/>
-      </w:pPr>
-      <w:r>
-        <w:t>五座島如何對應妳的工作</w:t>
-      </w:r>
-    </w:p>
-    <w:tbl>
-      <w:tblPr>
-        <w:tblW w:type="auto" w:w="0"/>
-        <w:tblLayout w:type="fixed"/>
-        <w:tblLook w:firstColumn="1" w:firstRow="1" w:lastColumn="0" w:lastRow="0" w:noHBand="0" w:noVBand="1" w:val="04A0"/>
-      </w:tblPr>
-      <w:tblGrid>
-        <w:gridCol w:w="1800"/>
-        <w:gridCol w:w="3240"/>
-        <w:gridCol w:w="4752"/>
-      </w:tblGrid>
-      <w:tr>
-        <w:trPr>
-          <w:cantSplit/>
-          <w:tblHeader/>
-        </w:trPr>
-        <w:tc>
-          <w:tcPr>
-            <w:tcW w:type="dxa" w:w="1800"/>
-            <w:shd w:fill="E4EAF2"/>
-          </w:tcPr>
-          <w:p>
-            <w:pPr>
-              <w:spacing w:after="100" w:before="100"/>
-            </w:pPr>
-            <w:r>
-              <w:rPr>
-                <w:b/>
-                <w:sz w:val="19"/>
-              </w:rPr>
-              <w:t>島</w:t>
-            </w:r>
-          </w:p>
-        </w:tc>
-        <w:tc>
-          <w:tcPr>
-            <w:tcW w:type="dxa" w:w="3240"/>
-            <w:shd w:fill="E4EAF2"/>
-          </w:tcPr>
-          <w:p>
-            <w:pPr>
-              <w:spacing w:after="100" w:before="100"/>
-            </w:pPr>
-            <w:r>
-              <w:rPr>
-                <w:b/>
-                <w:sz w:val="19"/>
-              </w:rPr>
-              <w:t>點開會看到什麼</w:t>
-            </w:r>
-          </w:p>
-        </w:tc>
-        <w:tc>
-          <w:tcPr>
-            <w:tcW w:type="dxa" w:w="4752"/>
-            <w:shd w:fill="E4EAF2"/>
-          </w:tcPr>
-          <w:p>
-            <w:pPr>
-              <w:spacing w:after="100" w:before="100"/>
-            </w:pPr>
-            <w:r>
-              <w:rPr>
-                <w:b/>
-                <w:sz w:val="19"/>
-              </w:rPr>
-              <w:t>目前依據與下一步</w:t>
-            </w:r>
-          </w:p>
-        </w:tc>
-      </w:tr>
-      <w:tr>
-        <w:trPr>
-          <w:cantSplit/>
-        </w:trPr>
-        <w:tc>
-          <w:tcPr>
-            <w:tcW w:type="dxa" w:w="1800"/>
-            <w:shd w:fill="FFFFFF"/>
-          </w:tcPr>
-          <w:p>
-            <w:pPr>
-              <w:spacing w:after="100" w:before="100"/>
-            </w:pPr>
-            <w:r>
-              <w:rPr>
-                <w:b w:val="0"/>
-                <w:sz w:val="19"/>
-              </w:rPr>
-              <w:t>研究羅盤</w:t>
-            </w:r>
-          </w:p>
-        </w:tc>
-        <w:tc>
-          <w:tcPr>
-            <w:tcW w:type="dxa" w:w="3240"/>
-            <w:shd w:fill="FFFFFF"/>
-          </w:tcPr>
-          <w:p>
-            <w:pPr>
-              <w:spacing w:after="100" w:before="100"/>
-            </w:pPr>
-            <w:r>
-              <w:rPr>
-                <w:b w:val="0"/>
-                <w:sz w:val="19"/>
-              </w:rPr>
-              <w:t>研究問題、目前方向、待決事項</w:t>
-            </w:r>
-          </w:p>
-        </w:tc>
-        <w:tc>
-          <w:tcPr>
-            <w:tcW w:type="dxa" w:w="4752"/>
-            <w:shd w:fill="FFFFFF"/>
-          </w:tcPr>
-          <w:p>
-            <w:pPr>
-              <w:spacing w:after="100" w:before="100"/>
-            </w:pPr>
-            <w:r>
-              <w:rPr>
-                <w:b w:val="0"/>
-                <w:sz w:val="19"/>
-              </w:rPr>
-              <w:t>A 字面查找／B 完整 AI 問答已確立；正式題目、語料邊界仍待對齊</w:t>
-            </w:r>
-          </w:p>
-        </w:tc>
-      </w:tr>
-      <w:tr>
-        <w:trPr>
-          <w:cantSplit/>
-        </w:trPr>
-        <w:tc>
-          <w:tcPr>
-            <w:tcW w:type="dxa" w:w="1800"/>
-            <w:shd w:fill="F7F8FA"/>
-          </w:tcPr>
-          <w:p>
-            <w:pPr>
-              <w:spacing w:after="100" w:before="100"/>
-            </w:pPr>
-            <w:r>
-              <w:rPr>
-                <w:b w:val="0"/>
-                <w:sz w:val="19"/>
-              </w:rPr>
-              <w:t>文獻書屋</w:t>
-            </w:r>
-          </w:p>
-        </w:tc>
-        <w:tc>
-          <w:tcPr>
-            <w:tcW w:type="dxa" w:w="3240"/>
-            <w:shd w:fill="F7F8FA"/>
-          </w:tcPr>
-          <w:p>
-            <w:pPr>
-              <w:spacing w:after="100" w:before="100"/>
-            </w:pPr>
-            <w:r>
-              <w:rPr>
-                <w:b w:val="0"/>
-                <w:sz w:val="19"/>
-              </w:rPr>
-              <w:t>紫區選用文獻、用途、原文或筆記入口</w:t>
-            </w:r>
-          </w:p>
-        </w:tc>
-        <w:tc>
-          <w:tcPr>
-            <w:tcW w:type="dxa" w:w="4752"/>
-            <w:shd w:fill="F7F8FA"/>
-          </w:tcPr>
-          <w:p>
-            <w:pPr>
-              <w:spacing w:after="100" w:before="100"/>
-            </w:pPr>
-            <w:r>
-              <w:rPr>
-                <w:b w:val="0"/>
-                <w:sz w:val="19"/>
-              </w:rPr>
-              <w:t>已有四份固定版本沿用筆記；選入不代表本人讀完或已查核全文</w:t>
-            </w:r>
-          </w:p>
-        </w:tc>
-      </w:tr>
-      <w:tr>
-        <w:trPr>
-          <w:cantSplit/>
-        </w:trPr>
-        <w:tc>
-          <w:tcPr>
-            <w:tcW w:type="dxa" w:w="1800"/>
-            <w:shd w:fill="FFFFFF"/>
-          </w:tcPr>
-          <w:p>
-            <w:pPr>
-              <w:spacing w:after="100" w:before="100"/>
-            </w:pPr>
-            <w:r>
-              <w:rPr>
-                <w:b w:val="0"/>
-                <w:sz w:val="19"/>
-              </w:rPr>
-              <w:t>實驗島</w:t>
-            </w:r>
-          </w:p>
-        </w:tc>
-        <w:tc>
-          <w:tcPr>
-            <w:tcW w:type="dxa" w:w="3240"/>
-            <w:shd w:fill="FFFFFF"/>
-          </w:tcPr>
-          <w:p>
-            <w:pPr>
-              <w:spacing w:after="100" w:before="100"/>
-            </w:pPr>
-            <w:r>
-              <w:rPr>
-                <w:b w:val="0"/>
-                <w:sz w:val="19"/>
-              </w:rPr>
-              <w:t>方法說明、A／B 入口、測試與人工核對</w:t>
-            </w:r>
-          </w:p>
-        </w:tc>
-        <w:tc>
-          <w:tcPr>
-            <w:tcW w:type="dxa" w:w="4752"/>
-            <w:shd w:fill="FFFFFF"/>
-          </w:tcPr>
-          <w:p>
-            <w:pPr>
-              <w:spacing w:after="100" w:before="100"/>
-            </w:pPr>
-            <w:r>
-              <w:rPr>
-                <w:b w:val="0"/>
-                <w:sz w:val="19"/>
-              </w:rPr>
-              <w:t>紫區開發版及架構圖已存在；方法、操作和正式評分規程待完成</w:t>
-            </w:r>
-          </w:p>
-        </w:tc>
-      </w:tr>
-      <w:tr>
-        <w:trPr>
-          <w:cantSplit/>
-        </w:trPr>
-        <w:tc>
-          <w:tcPr>
-            <w:tcW w:type="dxa" w:w="1800"/>
-            <w:shd w:fill="F7F8FA"/>
-          </w:tcPr>
-          <w:p>
-            <w:pPr>
-              <w:spacing w:after="100" w:before="100"/>
-            </w:pPr>
-            <w:r>
-              <w:rPr>
-                <w:b w:val="0"/>
-                <w:sz w:val="19"/>
-              </w:rPr>
-              <w:t>章節書房</w:t>
-            </w:r>
-          </w:p>
-        </w:tc>
-        <w:tc>
-          <w:tcPr>
-            <w:tcW w:type="dxa" w:w="3240"/>
-            <w:shd w:fill="F7F8FA"/>
-          </w:tcPr>
-          <w:p>
-            <w:pPr>
-              <w:spacing w:after="100" w:before="100"/>
-            </w:pPr>
-            <w:r>
-              <w:rPr>
-                <w:b w:val="0"/>
-                <w:sz w:val="19"/>
-              </w:rPr>
-              <w:t>第一至五章狀態、當前寫作稿、待補處</w:t>
-            </w:r>
-          </w:p>
-        </w:tc>
-        <w:tc>
-          <w:tcPr>
-            <w:tcW w:type="dxa" w:w="4752"/>
-            <w:shd w:fill="F7F8FA"/>
-          </w:tcPr>
-          <w:p>
-            <w:pPr>
-              <w:spacing w:after="100" w:before="100"/>
-            </w:pPr>
-            <w:r>
-              <w:rPr>
-                <w:b w:val="0"/>
-                <w:sz w:val="19"/>
-              </w:rPr>
-              <w:t>新第三章有 3.1–3.3 起點；不把綠區舊稿當紫區已完成章節</w:t>
-            </w:r>
-          </w:p>
-        </w:tc>
-      </w:tr>
-      <w:tr>
-        <w:trPr>
-          <w:cantSplit/>
-        </w:trPr>
-        <w:tc>
-          <w:tcPr>
-            <w:tcW w:type="dxa" w:w="1800"/>
-            <w:shd w:fill="FFFFFF"/>
-          </w:tcPr>
-          <w:p>
-            <w:pPr>
-              <w:spacing w:after="100" w:before="100"/>
-            </w:pPr>
-            <w:r>
-              <w:rPr>
-                <w:b w:val="0"/>
-                <w:sz w:val="19"/>
-              </w:rPr>
-              <w:t>會議碼頭</w:t>
-            </w:r>
-          </w:p>
-        </w:tc>
-        <w:tc>
-          <w:tcPr>
-            <w:tcW w:type="dxa" w:w="3240"/>
-            <w:shd w:fill="FFFFFF"/>
-          </w:tcPr>
-          <w:p>
-            <w:pPr>
-              <w:spacing w:after="100" w:before="100"/>
-            </w:pPr>
-            <w:r>
-              <w:rPr>
-                <w:b w:val="0"/>
-                <w:sz w:val="19"/>
-              </w:rPr>
-              <w:t>教授意見、待討論問題、交班與下一步</w:t>
-            </w:r>
-          </w:p>
-        </w:tc>
-        <w:tc>
-          <w:tcPr>
-            <w:tcW w:type="dxa" w:w="4752"/>
-            <w:shd w:fill="FFFFFF"/>
-          </w:tcPr>
-          <w:p>
-            <w:pPr>
-              <w:spacing w:after="100" w:before="100"/>
-            </w:pPr>
-            <w:r>
-              <w:rPr>
-                <w:b w:val="0"/>
-                <w:sz w:val="19"/>
-              </w:rPr>
-              <w:t>以現行接力與有日期的會議紀錄為準；未知時程顯示待確認</w:t>
-            </w:r>
-          </w:p>
-        </w:tc>
-      </w:tr>
-    </w:tbl>
-    <w:p/>
-    <w:p>
-      <w:r>
-        <w:t>綠區放在「歷史港口」入口，保留回溯。依 10/23 最新決定，論文知識庫、工作稿與成果公開，四處同步；島以連結開啟已公開正本。原始執行資料仍先依欄位掃描，金鑰、密碼與 .env 不公開。資料公開不改變主機網路設定。</w:t>
-      </w:r>
-    </w:p>
-    <w:p>
-      <w:r>
-        <w:t>手機第一屏：現在做到哪裡、下一步一件事、五島地圖。點島開下方卡片；卡片只放狀態、依據、下一步及開啟正本。提供「島嶼／清單」切換；字體至少 16px、操作區至少 44px。3D 用來找方向，清單讓妳快速辦事。</w:t>
-      </w:r>
-    </w:p>
-    <w:p>
-      <w:pPr>
-        <w:pStyle w:val="Heading1"/>
-      </w:pPr>
-      <w:r>
-        <w:t>模型如何分工</w:t>
-      </w:r>
-    </w:p>
-    <w:tbl>
-      <w:tblPr>
-        <w:tblW w:type="auto" w:w="0"/>
-        <w:tblLayout w:type="fixed"/>
-        <w:tblLook w:firstColumn="1" w:firstRow="1" w:lastColumn="0" w:lastRow="0" w:noHBand="0" w:noVBand="1" w:val="04A0"/>
-      </w:tblPr>
-      <w:tblGrid>
-        <w:gridCol w:w="1800"/>
-        <w:gridCol w:w="3240"/>
-        <w:gridCol w:w="4752"/>
-      </w:tblGrid>
-      <w:tr>
-        <w:trPr>
-          <w:cantSplit/>
-          <w:tblHeader/>
-        </w:trPr>
-        <w:tc>
-          <w:tcPr>
-            <w:tcW w:type="dxa" w:w="1800"/>
-            <w:shd w:fill="E4EAF2"/>
-          </w:tcPr>
-          <w:p>
-            <w:pPr>
-              <w:spacing w:after="100" w:before="100"/>
-            </w:pPr>
-            <w:r>
-              <w:rPr>
-                <w:b/>
-                <w:sz w:val="19"/>
-              </w:rPr>
-              <w:t>工作</w:t>
-            </w:r>
-          </w:p>
-        </w:tc>
-        <w:tc>
-          <w:tcPr>
-            <w:tcW w:type="dxa" w:w="3240"/>
-            <w:shd w:fill="E4EAF2"/>
-          </w:tcPr>
-          <w:p>
-            <w:pPr>
-              <w:spacing w:after="100" w:before="100"/>
-            </w:pPr>
-            <w:r>
-              <w:rPr>
-                <w:b/>
-                <w:sz w:val="19"/>
-              </w:rPr>
-              <w:t>推薦角色或模型</w:t>
-            </w:r>
-          </w:p>
-        </w:tc>
-        <w:tc>
-          <w:tcPr>
-            <w:tcW w:type="dxa" w:w="4752"/>
-            <w:shd w:fill="E4EAF2"/>
-          </w:tcPr>
-          <w:p>
-            <w:pPr>
-              <w:spacing w:after="100" w:before="100"/>
-            </w:pPr>
-            <w:r>
-              <w:rPr>
-                <w:b/>
-                <w:sz w:val="19"/>
-              </w:rPr>
-              <w:t>選擇理由與界線</w:t>
-            </w:r>
-          </w:p>
-        </w:tc>
-      </w:tr>
-      <w:tr>
-        <w:trPr>
-          <w:cantSplit/>
-        </w:trPr>
-        <w:tc>
-          <w:tcPr>
-            <w:tcW w:type="dxa" w:w="1800"/>
-            <w:shd w:fill="FFFFFF"/>
-          </w:tcPr>
-          <w:p>
-            <w:pPr>
-              <w:spacing w:after="100" w:before="100"/>
-            </w:pPr>
-            <w:r>
-              <w:rPr>
-                <w:b w:val="0"/>
-                <w:sz w:val="19"/>
-              </w:rPr>
-              <w:t>造島介面與一般實作</w:t>
-            </w:r>
-          </w:p>
-        </w:tc>
-        <w:tc>
-          <w:tcPr>
-            <w:tcW w:type="dxa" w:w="3240"/>
-            <w:shd w:fill="FFFFFF"/>
-          </w:tcPr>
-          <w:p>
-            <w:pPr>
-              <w:spacing w:after="100" w:before="100"/>
-            </w:pPr>
-            <w:r>
-              <w:rPr>
-                <w:b w:val="0"/>
-                <w:sz w:val="19"/>
-              </w:rPr>
-              <w:t>茜茜 Claude Sonnet 5.5</w:t>
-            </w:r>
-          </w:p>
-        </w:tc>
-        <w:tc>
-          <w:tcPr>
-            <w:tcW w:type="dxa" w:w="4752"/>
-            <w:shd w:fill="FFFFFF"/>
-          </w:tcPr>
-          <w:p>
-            <w:pPr>
-              <w:spacing w:after="100" w:before="100"/>
-            </w:pPr>
-            <w:r>
-              <w:rPr>
-                <w:b w:val="0"/>
-                <w:sz w:val="19"/>
-              </w:rPr>
-              <w:t>本輪已實際呼叫成功；適合作為一般程式工作起點，並非已測得造島品質第一</w:t>
-            </w:r>
-          </w:p>
-        </w:tc>
-      </w:tr>
-      <w:tr>
-        <w:trPr>
-          <w:cantSplit/>
-        </w:trPr>
-        <w:tc>
-          <w:tcPr>
-            <w:tcW w:type="dxa" w:w="1800"/>
-            <w:shd w:fill="F7F8FA"/>
-          </w:tcPr>
-          <w:p>
-            <w:pPr>
-              <w:spacing w:after="100" w:before="100"/>
-            </w:pPr>
-            <w:r>
-              <w:rPr>
-                <w:b w:val="0"/>
-                <w:sz w:val="19"/>
-              </w:rPr>
-              <w:t>資料契約、串接、測試與整合</w:t>
-            </w:r>
-          </w:p>
-        </w:tc>
-        <w:tc>
-          <w:tcPr>
-            <w:tcW w:type="dxa" w:w="3240"/>
-            <w:shd w:fill="F7F8FA"/>
-          </w:tcPr>
-          <w:p>
-            <w:pPr>
-              <w:spacing w:after="100" w:before="100"/>
-            </w:pPr>
-            <w:r>
-              <w:rPr>
-                <w:b w:val="0"/>
-                <w:sz w:val="19"/>
-              </w:rPr>
-              <w:t>Codex；困難問題用目前可用 Astra</w:t>
-            </w:r>
-          </w:p>
-        </w:tc>
-        <w:tc>
-          <w:tcPr>
-            <w:tcW w:type="dxa" w:w="4752"/>
-            <w:shd w:fill="F7F8FA"/>
-          </w:tcPr>
-          <w:p>
-            <w:pPr>
-              <w:spacing w:after="100" w:before="100"/>
-            </w:pPr>
-            <w:r>
-              <w:rPr>
-                <w:b w:val="0"/>
-                <w:sz w:val="19"/>
-              </w:rPr>
-              <w:t>依工作難度分配；小型明確修改才交較輕模型，不額外堆一群常駐代理</w:t>
-            </w:r>
-          </w:p>
-        </w:tc>
-      </w:tr>
-      <w:tr>
-        <w:trPr>
-          <w:cantSplit/>
-        </w:trPr>
-        <w:tc>
-          <w:tcPr>
-            <w:tcW w:type="dxa" w:w="1800"/>
-            <w:shd w:fill="FFFFFF"/>
-          </w:tcPr>
-          <w:p>
-            <w:pPr>
-              <w:spacing w:after="100" w:before="100"/>
-            </w:pPr>
-            <w:r>
-              <w:rPr>
-                <w:b w:val="0"/>
-                <w:sz w:val="19"/>
-              </w:rPr>
-              <w:t>難解的設計或架構問題</w:t>
-            </w:r>
-          </w:p>
-        </w:tc>
-        <w:tc>
-          <w:tcPr>
-            <w:tcW w:type="dxa" w:w="3240"/>
-            <w:shd w:fill="FFFFFF"/>
-          </w:tcPr>
-          <w:p>
-            <w:pPr>
-              <w:spacing w:after="100" w:before="100"/>
-            </w:pPr>
-            <w:r>
-              <w:rPr>
-                <w:b w:val="0"/>
-                <w:sz w:val="19"/>
-              </w:rPr>
-              <w:t>Claude Opus 或 Astra</w:t>
-            </w:r>
-          </w:p>
-        </w:tc>
-        <w:tc>
-          <w:tcPr>
-            <w:tcW w:type="dxa" w:w="4752"/>
-            <w:shd w:fill="FFFFFF"/>
-          </w:tcPr>
-          <w:p>
-            <w:pPr>
-              <w:spacing w:after="100" w:before="100"/>
-            </w:pPr>
-            <w:r>
-              <w:rPr>
-                <w:b w:val="0"/>
-                <w:sz w:val="19"/>
-              </w:rPr>
-              <w:t>一般模型有根據修正仍卡關時才升級；先核對帳號可用版本</w:t>
-            </w:r>
-          </w:p>
-        </w:tc>
-      </w:tr>
-      <w:tr>
-        <w:trPr>
-          <w:cantSplit/>
-        </w:trPr>
-        <w:tc>
-          <w:tcPr>
-            <w:tcW w:type="dxa" w:w="1800"/>
-            <w:shd w:fill="F7F8FA"/>
-          </w:tcPr>
-          <w:p>
-            <w:pPr>
-              <w:spacing w:after="100" w:before="100"/>
-            </w:pPr>
-            <w:r>
-              <w:rPr>
-                <w:b w:val="0"/>
-                <w:sz w:val="19"/>
-              </w:rPr>
-              <w:t>島的渲染與進度呈現</w:t>
-            </w:r>
-          </w:p>
-        </w:tc>
-        <w:tc>
-          <w:tcPr>
-            <w:tcW w:type="dxa" w:w="3240"/>
-            <w:shd w:fill="F7F8FA"/>
-          </w:tcPr>
-          <w:p>
-            <w:pPr>
-              <w:spacing w:after="100" w:before="100"/>
-            </w:pPr>
-            <w:r>
-              <w:rPr>
-                <w:b w:val="0"/>
-                <w:sz w:val="19"/>
-              </w:rPr>
-              <w:t>不需語言模型</w:t>
-            </w:r>
-          </w:p>
-        </w:tc>
-        <w:tc>
-          <w:tcPr>
-            <w:tcW w:type="dxa" w:w="4752"/>
-            <w:shd w:fill="F7F8FA"/>
-          </w:tcPr>
-          <w:p>
-            <w:pPr>
-              <w:spacing w:after="100" w:before="100"/>
-            </w:pPr>
-            <w:r>
-              <w:rPr>
-                <w:b w:val="0"/>
-                <w:sz w:val="19"/>
-              </w:rPr>
-              <w:t>Three.js 與有來源的快照即可；雲、海水、小人不應消耗生成 API</w:t>
-            </w:r>
-          </w:p>
-        </w:tc>
-      </w:tr>
-      <w:tr>
-        <w:trPr>
-          <w:cantSplit/>
-        </w:trPr>
-        <w:tc>
-          <w:tcPr>
-            <w:tcW w:type="dxa" w:w="1800"/>
-            <w:shd w:fill="FFFFFF"/>
-          </w:tcPr>
-          <w:p>
-            <w:pPr>
-              <w:spacing w:after="100" w:before="100"/>
-            </w:pPr>
-            <w:r>
-              <w:rPr>
-                <w:b w:val="0"/>
-                <w:sz w:val="19"/>
-              </w:rPr>
-              <w:t>現行 B 組問答</w:t>
-            </w:r>
-          </w:p>
-        </w:tc>
-        <w:tc>
-          <w:tcPr>
-            <w:tcW w:type="dxa" w:w="3240"/>
-            <w:shd w:fill="FFFFFF"/>
-          </w:tcPr>
-          <w:p>
-            <w:pPr>
-              <w:spacing w:after="100" w:before="100"/>
-            </w:pPr>
-            <w:r>
-              <w:rPr>
-                <w:b w:val="0"/>
-                <w:sz w:val="19"/>
-              </w:rPr>
-              <w:t>維持 gpt-5.4-mini-2026-03-17</w:t>
-            </w:r>
-          </w:p>
-        </w:tc>
-        <w:tc>
-          <w:tcPr>
-            <w:tcW w:type="dxa" w:w="4752"/>
-            <w:shd w:fill="FFFFFF"/>
-          </w:tcPr>
-          <w:p>
-            <w:pPr>
-              <w:spacing w:after="100" w:before="100"/>
-            </w:pPr>
-            <w:r>
-              <w:rPr>
-                <w:b w:val="0"/>
-                <w:sz w:val="19"/>
-              </w:rPr>
-              <w:t>這是暫用基準，未證明最佳；不因造島更動研究引擎</w:t>
-            </w:r>
-          </w:p>
-        </w:tc>
-      </w:tr>
-      <w:tr>
-        <w:trPr>
-          <w:cantSplit/>
-        </w:trPr>
-        <w:tc>
-          <w:tcPr>
-            <w:tcW w:type="dxa" w:w="1800"/>
-            <w:shd w:fill="F7F8FA"/>
-          </w:tcPr>
-          <w:p>
-            <w:pPr>
-              <w:spacing w:after="100" w:before="100"/>
-            </w:pPr>
-            <w:r>
-              <w:rPr>
-                <w:b w:val="0"/>
-                <w:sz w:val="19"/>
-              </w:rPr>
-              <w:t>檢索與字面查找</w:t>
-            </w:r>
-          </w:p>
-        </w:tc>
-        <w:tc>
-          <w:tcPr>
-            <w:tcW w:type="dxa" w:w="3240"/>
-            <w:shd w:fill="F7F8FA"/>
-          </w:tcPr>
-          <w:p>
-            <w:pPr>
-              <w:spacing w:after="100" w:before="100"/>
-            </w:pPr>
-            <w:r>
-              <w:rPr>
-                <w:b w:val="0"/>
-                <w:sz w:val="19"/>
-              </w:rPr>
-              <w:t>本機 BGE／A 原字串查找</w:t>
-            </w:r>
-          </w:p>
-        </w:tc>
-        <w:tc>
-          <w:tcPr>
-            <w:tcW w:type="dxa" w:w="4752"/>
-            <w:shd w:fill="F7F8FA"/>
-          </w:tcPr>
-          <w:p>
-            <w:pPr>
-              <w:spacing w:after="100" w:before="100"/>
-            </w:pPr>
-            <w:r>
-              <w:rPr>
-                <w:b w:val="0"/>
-                <w:sz w:val="19"/>
-              </w:rPr>
-              <w:t>保留既有固定版本；A 不需要語言模型</w:t>
-            </w:r>
-          </w:p>
-        </w:tc>
-      </w:tr>
-    </w:tbl>
-    <w:p/>
-    <w:p>
-      <w:r>
-        <w:t>本輪 Claude 實際回報模型為 claude-sonnet-5-5。OpenAI 官方建議以同樣輸入比較模型、保留達標的較輕設定；Anthropic 的 Claude Code 指南推薦 Sonnet 處理多數程式工作，Opus 處理困難架構或除錯。這些是選型起點，不是本案品質實測。[1][2]</w:t>
-      </w:r>
-    </w:p>
-    <w:p>
-      <w:r>
-        <w:t>目前 Codex 工具列出的可委派模型為 gpt-6-astra 及 gpt-5.6-sol／terra／luna；官方網站的模型目錄可能更廣，不能當成此帳號全都可用。本輪沒有修改任何帳號預設模型。</w:t>
+        <w:t>五個展區與十五個攤位</w:t>
       </w:r>
     </w:p>
     <w:p>
@@ -874,485 +33,208 @@
         <w:pStyle w:val="Heading2"/>
       </w:pPr>
       <w:r>
-        <w:t>真正挑出適合妳的 B 組模型</w:t>
+        <w:t>靈感服務台  2 個攤位</w:t>
       </w:r>
     </w:p>
     <w:p>
       <w:r>
-        <w:t>先比較現行 mini 與已確認可用的 Claude Sonnet 候選，不擴大成全市場競賽。若日後做測試，要確認 API 端可用模型與固定 ID；Claude Code 成功不代表 API 帳號已開通相同模型。</w:t>
+        <w:t>研究方向、題目與研究問題</w:t>
       </w:r>
     </w:p>
     <w:p>
       <w:r>
-        <w:t>用 20 題開發題，含直接查找、生活口語、模糊條件、多項需求、前文追問、資料庫未收錄等類型。不要抽正式保留題來挑模型。每模型每題做兩次，先固定來源片段比較生成，再對最有希望的方案測完整改寫、檢索與回答流程。後者的模型呼叫數可能多於問答次數。</w:t>
+        <w:t>以同一文件庫中的字面查找與完整 AI 問答為探索主題；正式題目、問題與語料仍在設計討論。</w:t>
+      </w:r>
+    </w:p>
+    <w:p>
+      <w:pPr>
+        <w:pStyle w:val="Heading2"/>
+      </w:pPr>
+      <w:r>
+        <w:t>文獻交換市集  4 個攤位</w:t>
       </w:r>
     </w:p>
     <w:p>
       <w:r>
-        <w:t>20 題須在看結果前凍結，記錄出題者，避免與正式題及其改寫重疊。兩模型各跑兩次共 80 筆生成結果；先分成每次 10 筆的人工核對批次，再決定是否擴至完整流程。</w:t>
+        <w:t>A13 · 詞彙落差、A18 · 全文檢索評估、A19 · ASK、A20 · 互動檢索評估</w:t>
       </w:r>
     </w:p>
     <w:p>
       <w:r>
-        <w:t>人工遮住模型名稱並打亂順序，核對事實、引用支持、回答完整、必要釐清與誠實拒答；另記回應時間及實際 tokens／成本。編造來源或重大錯答需單列失敗，不用平均分掩蓋。先定可接受品質，再選較快、較省者。AI 可以協助挑出疑點，不能代替人工標準答案與正式抽核。[3]</w:t>
+        <w:t>四份固定版本材料可以自由探索；放進試玩場只代表提供閱讀入口，不代表已完成研讀。</w:t>
+      </w:r>
+    </w:p>
+    <w:p>
+      <w:pPr>
+        <w:pStyle w:val="Heading2"/>
+      </w:pPr>
+      <w:r>
+        <w:t>實驗遊樂工坊  4 個攤位</w:t>
       </w:r>
     </w:p>
     <w:p>
       <w:r>
-        <w:t>100 美元是本人告知的 Claude API 資源，非已核實餘額。本輪只完成 CLI 評估，未動用研究平台做選型測試；CLI 的列表價成本不等於 API 餘額扣款。未估算整座島的實際建置費用。</w:t>
+        <w:t>進入 A/B 實驗、語料與方法、評分設計試想桌、平台架構</w:t>
+      </w:r>
+    </w:p>
+    <w:p>
+      <w:r>
+        <w:t>A/B 法規查詢平台已可操作，目前是開發版。正式題組、操作規程、評分與結果尚未完成。</w:t>
       </w:r>
     </w:p>
     <w:p>
       <w:pPr>
-        <w:pStyle w:val="Heading1"/>
+        <w:pStyle w:val="Heading2"/>
       </w:pPr>
       <w:r>
-        <w:t>架構與真實進度</w:t>
+        <w:t>章節創作展廊  3 個攤位</w:t>
       </w:r>
     </w:p>
     <w:p>
       <w:r>
-        <w:t>資料流：共同大腦與紫區程式的固定版本 → 白名單快照 → 五島畫面。未來經刪敏的實際執行事件 → 唯讀事件轉接層 → 實驗島。島只是入口與呈現，不另外複製論文正本。</w:t>
-      </w:r>
-    </w:p>
-    <w:tbl>
-      <w:tblPr>
-        <w:tblW w:type="auto" w:w="0"/>
-        <w:tblLayout w:type="fixed"/>
-        <w:tblLook w:firstColumn="1" w:firstRow="1" w:lastColumn="0" w:lastRow="0" w:noHBand="0" w:noVBand="1" w:val="04A0"/>
-      </w:tblPr>
-      <w:tblGrid>
-        <w:gridCol w:w="1800"/>
-        <w:gridCol w:w="3240"/>
-        <w:gridCol w:w="4752"/>
-      </w:tblGrid>
-      <w:tr>
-        <w:trPr>
-          <w:cantSplit/>
-          <w:tblHeader/>
-        </w:trPr>
-        <w:tc>
-          <w:tcPr>
-            <w:tcW w:type="dxa" w:w="1800"/>
-            <w:shd w:fill="E4EAF2"/>
-          </w:tcPr>
-          <w:p>
-            <w:pPr>
-              <w:spacing w:after="100" w:before="100"/>
-            </w:pPr>
-            <w:r>
-              <w:rPr>
-                <w:b/>
-                <w:sz w:val="19"/>
-              </w:rPr>
-              <w:t>畫面層</w:t>
-            </w:r>
-          </w:p>
-        </w:tc>
-        <w:tc>
-          <w:tcPr>
-            <w:tcW w:type="dxa" w:w="3240"/>
-            <w:shd w:fill="E4EAF2"/>
-          </w:tcPr>
-          <w:p>
-            <w:pPr>
-              <w:spacing w:after="100" w:before="100"/>
-            </w:pPr>
-            <w:r>
-              <w:rPr>
-                <w:b/>
-                <w:sz w:val="19"/>
-              </w:rPr>
-              <w:t>真實來源</w:t>
-            </w:r>
-          </w:p>
-        </w:tc>
-        <w:tc>
-          <w:tcPr>
-            <w:tcW w:type="dxa" w:w="4752"/>
-            <w:shd w:fill="E4EAF2"/>
-          </w:tcPr>
-          <w:p>
-            <w:pPr>
-              <w:spacing w:after="100" w:before="100"/>
-            </w:pPr>
-            <w:r>
-              <w:rPr>
-                <w:b/>
-                <w:sz w:val="19"/>
-              </w:rPr>
-              <w:t>畫面應說清楚</w:t>
-            </w:r>
-          </w:p>
-        </w:tc>
-      </w:tr>
-      <w:tr>
-        <w:trPr>
-          <w:cantSplit/>
-        </w:trPr>
-        <w:tc>
-          <w:tcPr>
-            <w:tcW w:type="dxa" w:w="1800"/>
-            <w:shd w:fill="FFFFFF"/>
-          </w:tcPr>
-          <w:p>
-            <w:pPr>
-              <w:spacing w:after="100" w:before="100"/>
-            </w:pPr>
-            <w:r>
-              <w:rPr>
-                <w:b w:val="0"/>
-                <w:sz w:val="19"/>
-              </w:rPr>
-              <w:t>景觀</w:t>
-            </w:r>
-          </w:p>
-        </w:tc>
-        <w:tc>
-          <w:tcPr>
-            <w:tcW w:type="dxa" w:w="3240"/>
-            <w:shd w:fill="FFFFFF"/>
-          </w:tcPr>
-          <w:p>
-            <w:pPr>
-              <w:spacing w:after="100" w:before="100"/>
-            </w:pPr>
-            <w:r>
-              <w:rPr>
-                <w:b w:val="0"/>
-                <w:sz w:val="19"/>
-              </w:rPr>
-              <w:t>程式動畫</w:t>
-            </w:r>
-          </w:p>
-        </w:tc>
-        <w:tc>
-          <w:tcPr>
-            <w:tcW w:type="dxa" w:w="4752"/>
-            <w:shd w:fill="FFFFFF"/>
-          </w:tcPr>
-          <w:p>
-            <w:pPr>
-              <w:spacing w:after="100" w:before="100"/>
-            </w:pPr>
-            <w:r>
-              <w:rPr>
-                <w:b w:val="0"/>
-                <w:sz w:val="19"/>
-              </w:rPr>
-              <w:t>日夜與走路是裝飾，不代表工作正在執行</w:t>
-            </w:r>
-          </w:p>
-        </w:tc>
-      </w:tr>
-      <w:tr>
-        <w:trPr>
-          <w:cantSplit/>
-        </w:trPr>
-        <w:tc>
-          <w:tcPr>
-            <w:tcW w:type="dxa" w:w="1800"/>
-            <w:shd w:fill="F7F8FA"/>
-          </w:tcPr>
-          <w:p>
-            <w:pPr>
-              <w:spacing w:after="100" w:before="100"/>
-            </w:pPr>
-            <w:r>
-              <w:rPr>
-                <w:b w:val="0"/>
-                <w:sz w:val="19"/>
-              </w:rPr>
-              <w:t>研究進度</w:t>
-            </w:r>
-          </w:p>
-        </w:tc>
-        <w:tc>
-          <w:tcPr>
-            <w:tcW w:type="dxa" w:w="3240"/>
-            <w:shd w:fill="F7F8FA"/>
-          </w:tcPr>
-          <w:p>
-            <w:pPr>
-              <w:spacing w:after="100" w:before="100"/>
-            </w:pPr>
-            <w:r>
-              <w:rPr>
-                <w:b w:val="0"/>
-                <w:sz w:val="19"/>
-              </w:rPr>
-              <w:t>vault 固定 commit、文件與人工確認狀態</w:t>
-            </w:r>
-          </w:p>
-        </w:tc>
-        <w:tc>
-          <w:tcPr>
-            <w:tcW w:type="dxa" w:w="4752"/>
-            <w:shd w:fill="F7F8FA"/>
-          </w:tcPr>
-          <w:p>
-            <w:pPr>
-              <w:spacing w:after="100" w:before="100"/>
-            </w:pPr>
-            <w:r>
-              <w:rPr>
-                <w:b w:val="0"/>
-                <w:sz w:val="19"/>
-              </w:rPr>
-              <w:t>更新時間、來源、版本、待確認；無依據不填完成百分比</w:t>
-            </w:r>
-          </w:p>
-        </w:tc>
-      </w:tr>
-      <w:tr>
-        <w:trPr>
-          <w:cantSplit/>
-        </w:trPr>
-        <w:tc>
-          <w:tcPr>
-            <w:tcW w:type="dxa" w:w="1800"/>
-            <w:shd w:fill="FFFFFF"/>
-          </w:tcPr>
-          <w:p>
-            <w:pPr>
-              <w:spacing w:after="100" w:before="100"/>
-            </w:pPr>
-            <w:r>
-              <w:rPr>
-                <w:b w:val="0"/>
-                <w:sz w:val="19"/>
-              </w:rPr>
-              <w:t>AI 運作</w:t>
-            </w:r>
-          </w:p>
-        </w:tc>
-        <w:tc>
-          <w:tcPr>
-            <w:tcW w:type="dxa" w:w="3240"/>
-            <w:shd w:fill="FFFFFF"/>
-          </w:tcPr>
-          <w:p>
-            <w:pPr>
-              <w:spacing w:after="100" w:before="100"/>
-            </w:pPr>
-            <w:r>
-              <w:rPr>
-                <w:b w:val="0"/>
-                <w:sz w:val="19"/>
-              </w:rPr>
-              <w:t>後端事件與 run ID</w:t>
-            </w:r>
-          </w:p>
-        </w:tc>
-        <w:tc>
-          <w:tcPr>
-            <w:tcW w:type="dxa" w:w="4752"/>
-            <w:shd w:fill="FFFFFF"/>
-          </w:tcPr>
-          <w:p>
-            <w:pPr>
-              <w:spacing w:after="100" w:before="100"/>
-            </w:pPr>
-            <w:r>
-              <w:rPr>
-                <w:b w:val="0"/>
-                <w:sz w:val="19"/>
-              </w:rPr>
-              <w:t>何時開始、改寫完成、檢索完成、回答完成、失敗；沒有事件就顯示未接通</w:t>
-            </w:r>
-          </w:p>
-        </w:tc>
-      </w:tr>
-    </w:tbl>
-    <w:p/>
-    <w:p>
-      <w:r>
-        <w:t>看到 AI 運作，是看到可觀測的輸入、階段、結果和引用，不是取得模型私密思考鏈。第二階段才接實際事件；首版可用明標「示意」的重播教學流程。動畫時計與研究紀錄時間分開。</w:t>
+        <w:t>論文全文 · 可編輯工作稿、論文全文 · 47 頁閱讀版、五章核對與修訂建議</w:t>
       </w:r>
     </w:p>
     <w:p>
       <w:r>
-        <w:t>快照生成前檢查欄位與內容，排除不必要全文、未經整理的查詢內容、個資及敏感值。私人入口須 iPhone 已連原有 Tailscale；若連不上，告知檢查私人網路及 Mac 服務。若整個內網頁無法載入，說明需另放在使用者可存取的操作文件，不能依賴失聯頁自己顯示。</w:t>
+        <w:t>已有 47 頁五章完整工作稿；第三章需補強操作與評分，第四、五章正式結果及結論尚待實驗。</w:t>
+      </w:r>
+    </w:p>
+    <w:p>
+      <w:pPr>
+        <w:pStyle w:val="Heading2"/>
+      </w:pPr>
+      <w:r>
+        <w:t>研究相談廣場  2 個攤位</w:t>
       </w:r>
     </w:p>
     <w:p>
       <w:r>
-        <w:t>快照最少欄位：schemaVersion、generatedAt、sourceCommits、visibility、islands。每筆項目有 id、title、status、sourceUrl、sourceRevision、updatedAt、verifiedBy、nextAction、model（3D 造型種類）。語言模型另放 runtimeModel，避免和建物 model 混淆。未讀、AI 整理、本人核對、教授確認是不同狀態。</w:t>
+        <w:t>研究設計討論簿、三方協作與接力</w:t>
       </w:r>
     </w:p>
     <w:p>
       <w:r>
-        <w:t>本輪建議：每次研究成果已驗證並合併正本後重建快照；載入時標時間，超過 24 小時標「非即時快照」，這是新提案而非已設定排程。異常或中斷保留最後成功版本，但要顯示過期／連線狀態。</w:t>
+        <w:t>在這裡練習整理研究問題、語料與方法；展示的是設計討論草稿，沒有連接真實會議決議。</w:t>
+      </w:r>
+    </w:p>
+    <w:p>
+      <w:r>
+        <w:br w:type="page"/>
       </w:r>
     </w:p>
     <w:p>
       <w:pPr>
-        <w:pStyle w:val="Heading1"/>
+        <w:pStyle w:val="Title"/>
       </w:pPr>
       <w:r>
-        <w:t>如何改寫參考提示詞</w:t>
+        <w:t>探索方式與資料更新</w:t>
+      </w:r>
+    </w:p>
+    <w:p>
+      <w:pPr>
+        <w:pStyle w:val="Heading2"/>
+      </w:pPr>
+      <w:r>
+        <w:t>分身帶路</w:t>
       </w:r>
     </w:p>
     <w:p>
       <w:r>
-        <w:t>保留：3D 黏土風、六角島、固定種子、DATA 驅動、柔和色塊、橋、點選卡片、日夜選擇及手機 bottom sheet。</w:t>
+        <w:t>開啟 Tarshar 帶路，選攤位後沿路抵達。途中可直接閱讀、直接抵達或停止；也能回到自由探索。</w:t>
+      </w:r>
+    </w:p>
+    <w:p>
+      <w:pPr>
+        <w:pStyle w:val="Heading2"/>
+      </w:pPr>
+      <w:r>
+        <w:t>逐層閱讀</w:t>
       </w:r>
     </w:p>
     <w:p>
       <w:r>
-        <w:t>改為：五座研究功能島；每島先放少量有用途的建物。數字由真實資料帶入，未知留空，不把虛構的 50 個政策細項換成 50 個假論文成果。協作線區分「資料依賴」「有紀錄的交班」「示意流程」，不使用 official 標籤暗示政府或學術認證。</w:t>
+        <w:t>點展區，再選攤位，查看研究說明、狀態及原資料入口。節目單與搜尋提供快速閱讀方式。</w:t>
+      </w:r>
+    </w:p>
+    <w:p>
+      <w:pPr>
+        <w:pStyle w:val="Heading2"/>
+      </w:pPr>
+      <w:r>
+        <w:t>園遊會場景</w:t>
       </w:r>
     </w:p>
     <w:p>
       <w:r>
-        <w:t>分階段：</w:t>
+        <w:t>連續草地、摩天輪、帳篷、氣球與步道；支援旋轉、縮放、平移、滿視窗與日夜切換。</w:t>
+      </w:r>
+    </w:p>
+    <w:p>
+      <w:pPr>
+        <w:pStyle w:val="Heading2"/>
+      </w:pPr>
+      <w:r>
+        <w:t>虛構研究夥伴</w:t>
       </w:r>
     </w:p>
     <w:p>
       <w:r>
-        <w:t>1. 可執行骨架：五島、相機、水、光、橋、名稱；同資料清單先可用。CDN／WebGL 失敗仍有內容。</w:t>
+        <w:t>松果、栗子、阿栗、米露是虛構夥伴，不影射真人。Tarshar 公仔造型與 Logo 沿用定稿。</w:t>
+      </w:r>
+    </w:p>
+    <w:p>
+      <w:pPr>
+        <w:pStyle w:val="Heading2"/>
+      </w:pPr>
+      <w:r>
+        <w:t>資料更新方式</w:t>
       </w:r>
     </w:p>
     <w:p>
       <w:r>
-        <w:t>2. 研究入口：接白名單快照、點選卡、來源與下一步，連既有紫區平台及架構圖。按鈕用「進入 A/B 實驗」，不能誤稱「問我的論文」。</w:t>
+        <w:t>目前是模擬試玩實驗場。研究內容是有日期的固定版本快照，更新資料並重新發布後才反映新進度，尚未自動即時同步。散步、日夜與研究路線是展示互動，不代表 AI 正在執行研究。</w:t>
+      </w:r>
+    </w:p>
+    <w:p>
+      <w:pPr>
+        <w:pStyle w:val="Heading2"/>
+      </w:pPr>
+      <w:r>
+        <w:t>後續規劃</w:t>
       </w:r>
     </w:p>
     <w:p>
       <w:r>
-        <w:t>3. 黏土細節：少量建物零件共用、樹、書、燈、桌椅；遠距離隱藏小物件。日夜可切，減少動態偏好時凍結。</w:t>
+        <w:t>進度燈旗、里程碑慶祝、相同文件的檢索比較體驗、細項知識關聯與研究時間軸仍屬後續規劃，不能列為已完成。</w:t>
+      </w:r>
+    </w:p>
+    <w:p>
+      <w:pPr>
+        <w:pStyle w:val="Heading2"/>
+      </w:pPr>
+      <w:r>
+        <w:t>模型與協作</w:t>
       </w:r>
     </w:p>
     <w:p>
       <w:r>
-        <w:t>4. 實際事件：另接唯讀事件轉接層；真實 run 與示意動畫可辨，不為畫面改寫研究程序。</w:t>
+        <w:t>Codex 與茜茜依實際工作分工協作；3D 展示本身不呼叫語言模型。A/B 實驗是另一個需原有私人網路的服務，展示頁不改動其模型、語料或評分。尚無比較結果可宣稱哪個模型最適合。</w:t>
       </w:r>
     </w:p>
     <w:p>
       <w:r>
-        <w:t>5. 驗收：桌面及 390×844 手機尺寸、iPhone 真機、鍵盤、失敗回退、來源與權限。先交可用階段，再擴充小人與景觀。</w:t>
-      </w:r>
-    </w:p>
-    <w:p>
-      <w:r>
-        <w:t>單一 HTML 適合原型；正式私人版可拆開資料與渲染方便維護，並將 Three.js 固定版本存於本機服務，降低 CDN 失敗影響。前端不得放 API key。初始化要用可捕捉錯誤的動態 import；靜態 import 在執行前失敗，不能只靠內層 try/catch。</w:t>
-      </w:r>
-    </w:p>
-    <w:p>
-      <w:r>
-        <w:t>原提示詞的 20–30 draw calls 應視為靜態零件庫預算，不宣稱含陰影、水、線、標籤的全場景一定達到。動態 import 的錯誤處理依 MDN 說明。[5] 手機先訂 30 FPS 的試驗目標，實測後才談通過。首次不載入數千棵樹、不強迫 144 秒日夜輪轉。</w:t>
-      </w:r>
-    </w:p>
-    <w:p>
-      <w:pPr>
-        <w:pStyle w:val="Heading1"/>
-      </w:pPr>
-      <w:r>
-        <w:t>協作結論與後續</w:t>
-      </w:r>
-    </w:p>
-    <w:p>
-      <w:r>
-        <w:t>Codex 初案六島；Claude 建議合併方法與實驗，採五島。Claude 建議先 2D，Codex 依本人參考保留精簡 3D，附同資料清單回退。Claude 原建議從正式題庫取題選型，Codex 修正為獨立開發題，保留正式測試。兩端原始意見與覆核摘要另存協作紀錄，這些是提案而非教授核准方法。</w:t>
-      </w:r>
-    </w:p>
-    <w:p>
-      <w:r>
-        <w:t>建議先在原私人服務做五島原型與真實來源卡，設計文件同步公開網站，第一個驗收動作是：手機點「章節書房」能開到紫區第三章，點「實驗島」能進現有 A/B 平台。本輪只同步設計文件，未部署島嶼程式、替換模型或變更研究條件。</w:t>
-      </w:r>
-    </w:p>
-    <w:p>
-      <w:pPr>
-        <w:pStyle w:val="Heading1"/>
-      </w:pPr>
-      <w:r>
-        <w:t>來源與查核範圍</w:t>
-      </w:r>
-    </w:p>
-    <w:p>
-      <w:r>
-        <w:rPr>
-          <w:sz w:val="18"/>
-        </w:rPr>
-        <w:t>[1] OpenAI Model selection，2026-10-23 查閱：https://developers.openai.com/api/docs/guides/model-selection</w:t>
-      </w:r>
-    </w:p>
-    <w:p>
-      <w:r>
-        <w:rPr>
-          <w:sz w:val="18"/>
-        </w:rPr>
-        <w:t>[2] Anthropic Models, usage, and limits in Claude Code：https://support.claude.com/en/articles/14552983-models-usage-and-limits-in-claude-code</w:t>
-      </w:r>
-    </w:p>
-    <w:p>
-      <w:r>
-        <w:rPr>
-          <w:sz w:val="18"/>
-        </w:rPr>
-        <w:t>[3] OpenAI Evaluation best practices：https://developers.openai.com/api/docs/guides/evaluation-best-practices</w:t>
-      </w:r>
-    </w:p>
-    <w:p>
-      <w:r>
-        <w:rPr>
-          <w:sz w:val="18"/>
-        </w:rPr>
-        <w:t>[4] Anthropic Models overview：https://platform.claude.com/docs/en/models/overview （官方目錄，不代表帳號可用清單）</w:t>
-      </w:r>
-    </w:p>
-    <w:p>
-      <w:r>
-        <w:rPr>
-          <w:sz w:val="18"/>
-        </w:rPr>
-        <w:t>[5] MDN import()：https://developer.mozilla.org/en-US/docs/Web/JavaScript/Reference/Operators/import</w:t>
-      </w:r>
-    </w:p>
-    <w:p>
-      <w:r>
-        <w:rPr>
-          <w:sz w:val="18"/>
-        </w:rPr>
-        <w:t>專案依據：最新公開規則另見 vault da97926184d9c51bd058bc551bbd8218b4bcc776；初次盤點依 vault 250cfed35761f7bd978c826721bfd2811491e1ca 的 AI-COLLAB.md、目前有效論文接力、紫區 README；紫區程式本機 main a885e5895fbf336b7d375f77ebd6e3ca383de836 的 README 與 AGENTS.md。本輪讀取現況與既有驗證紀錄，未重跑平台測試，未逐份複核研究原文。</w:t>
-      </w:r>
-    </w:p>
-    <w:p>
-      <w:r>
-        <w:rPr>
-          <w:sz w:val="18"/>
-        </w:rPr>
-        <w:t>參考視覺：本人提供的 AgentArk／政策島截圖與完整提示詞；僅作風格與功能靈感。未取得 AgentArk 原始碼，未宣稱使用或整合 AgentArk 系統。</w:t>
+        <w:t>完整操作說明與資料入口請由研究同樂會網站開啟。早期五島名稱已停用；既有網址與程式 ID 保留，避免舊連結失效。</w:t>
       </w:r>
     </w:p>
     <w:sectPr>
-      <w:footerReference w:type="default" r:id="rId9"/>
       <w:pgSz w:w="11909" w:h="16834"/>
-      <w:pgMar w:top="936" w:right="1008" w:bottom="936" w:left="1008" w:header="720" w:footer="720" w:gutter="0"/>
+      <w:pgMar w:top="1008" w:right="1080" w:bottom="1008" w:left="1080" w:header="720" w:footer="720" w:gutter="0"/>
       <w:cols w:space="720"/>
       <w:docGrid w:linePitch="360"/>
     </w:sectPr>
   </w:body>
 </w:document>
-</file>
-
-<file path=word/footer1.xml><?xml version="1.0" encoding="utf-8"?>
-<w:ftr xmlns:m="http://schemas.openxmlformats.org/officeDocument/2006/math" xmlns:mc="http://schemas.openxmlformats.org/markup-compatibility/2006" xmlns:mo="http://schemas.microsoft.com/office/mac/office/2008/main" xmlns:mv="urn:schemas-microsoft-com:mac:vml" xmlns:o="urn:schemas-microsoft-com:office:office" xmlns:r="http://schemas.openxmlformats.org/officeDocument/2006/relationships" xmlns:v="urn:schemas-microsoft-com:vml" xmlns:w10="urn:schemas-microsoft-com:office:word" xmlns:w14="http://schemas.microsoft.com/office/word/2010/wordml" xmlns:w="http://schemas.openxmlformats.org/wordprocessingml/2006/main" xmlns:wne="http://schemas.microsoft.com/office/word/2006/wordml" xmlns:wp14="http://schemas.microsoft.com/office/word/2010/wordprocessingDrawing" xmlns:wp="http://schemas.openxmlformats.org/drawingml/2006/wordprocessingDrawing" xmlns:wpc="http://schemas.microsoft.com/office/word/2010/wordprocessingCanvas" xmlns:wpg="http://schemas.microsoft.com/office/word/2010/wordprocessingGroup" xmlns:wpi="http://schemas.microsoft.com/office/word/2010/wordprocessingInk" xmlns:wps="http://schemas.microsoft.com/office/word/2010/wordprocessingShape" mc:Ignorable="w14 wp14">
-  <w:p>
-    <w:pPr>
-      <w:pStyle w:val="Footer"/>
-      <w:jc w:val="right"/>
-    </w:pPr>
-    <w:r>
-      <w:rPr>
-        <w:color w:val="666666"/>
-        <w:sz w:val="16"/>
-      </w:rPr>
-      <w:t xml:space="preserve">論文智能島  設計提案  ·  </w:t>
-    </w:r>
-    <w:fldSimple w:instr="PAGE"/>
-  </w:p>
-</w:ftr>
 </file>
 
 <file path=word/numbering.xml><?xml version="1.0" encoding="utf-8"?>
@@ -1719,12 +601,12 @@
     <w:qFormat/>
     <w:rsid w:val="00FC693F"/>
     <w:pPr>
-      <w:spacing w:after="140" w:line="283" w:lineRule="auto"/>
+      <w:spacing w:after="140" w:line="276" w:lineRule="auto"/>
     </w:pPr>
     <w:rPr>
       <w:rFonts w:ascii="Noto Sans CJK TC" w:hAnsi="Noto Sans CJK TC" w:eastAsia="Noto Sans CJK TC"/>
       <w:color w:val="000000"/>
-      <w:sz w:val="21"/>
+      <w:sz w:val="22"/>
     </w:rPr>
   </w:style>
   <w:style w:type="paragraph" w:styleId="Header">
@@ -1782,7 +664,7 @@
     <w:pPr>
       <w:keepNext/>
       <w:keepLines/>
-      <w:spacing w:before="480" w:after="140" w:line="283" w:lineRule="auto"/>
+      <w:spacing w:before="480" w:after="140" w:line="276" w:lineRule="auto"/>
       <w:outlineLvl w:val="0"/>
     </w:pPr>
     <w:rPr>
@@ -1790,7 +672,7 @@
       <w:b/>
       <w:bCs/>
       <w:color w:val="000000"/>
-      <w:sz w:val="32"/>
+      <w:sz w:val="34"/>
       <w:szCs w:val="28"/>
     </w:rPr>
   </w:style>
@@ -1806,7 +688,7 @@
     <w:pPr>
       <w:keepNext/>
       <w:keepLines/>
-      <w:spacing w:before="200" w:after="140" w:line="283" w:lineRule="auto"/>
+      <w:spacing w:before="200" w:after="140" w:line="276" w:lineRule="auto"/>
       <w:outlineLvl w:val="1"/>
     </w:pPr>
     <w:rPr>
@@ -1814,7 +696,7 @@
       <w:b/>
       <w:bCs/>
       <w:color w:val="000000"/>
-      <w:sz w:val="25"/>
+      <w:sz w:val="26"/>
       <w:szCs w:val="26"/>
     </w:rPr>
   </w:style>
@@ -1830,15 +712,14 @@
     <w:pPr>
       <w:keepNext/>
       <w:keepLines/>
-      <w:spacing w:before="200" w:after="140" w:line="283" w:lineRule="auto"/>
+      <w:spacing w:before="200" w:after="0"/>
       <w:outlineLvl w:val="2"/>
     </w:pPr>
     <w:rPr>
-      <w:rFonts w:asciiTheme="majorHAnsi" w:eastAsiaTheme="majorEastAsia" w:hAnsiTheme="majorHAnsi" w:cstheme="majorBidi" w:ascii="Noto Sans CJK TC" w:hAnsi="Noto Sans CJK TC" w:eastAsia="Noto Sans CJK TC"/>
+      <w:rFonts w:asciiTheme="majorHAnsi" w:eastAsiaTheme="majorEastAsia" w:hAnsiTheme="majorHAnsi" w:cstheme="majorBidi"/>
       <w:b/>
       <w:bCs/>
-      <w:color w:val="000000"/>
-      <w:sz w:val="21"/>
+      <w:color w:val="4F81BD" w:themeColor="accent1"/>
     </w:rPr>
   </w:style>
   <w:style w:type="paragraph" w:styleId="Heading4">
@@ -2069,8 +950,7 @@
     <w:qFormat/>
     <w:rsid w:val="00FC693F"/>
     <w:pPr>
-      <w:keepNext/>
-      <w:spacing w:after="140" w:line="283" w:lineRule="auto"/>
+      <w:spacing w:after="140" w:line="276" w:lineRule="auto"/>
       <w:contextualSpacing/>
     </w:pPr>
     <w:rPr>
@@ -2078,7 +958,7 @@
       <w:color w:val="000000"/>
       <w:spacing w:val="5"/>
       <w:kern w:val="28"/>
-      <w:sz w:val="46"/>
+      <w:sz w:val="48"/>
       <w:szCs w:val="52"/>
     </w:rPr>
   </w:style>

</xml_diff>

<commit_message>
fix: refresh festival documentation and 59-page source baseline
</commit_message>
<xml_diff>
--- a/public/thesis-library/purple/island-plan/proposal.docx
+++ b/public/thesis-library/purple/island-plan/proposal.docx
@@ -92,12 +92,12 @@
     </w:p>
     <w:p>
       <w:r>
-        <w:t>論文全文 · 可編輯工作稿、論文全文 · 58 頁閱讀版、本次五章修訂與研究歷程</w:t>
+        <w:t>論文全文 · 59 頁老師排版Word、論文全文 · 59 頁老師排版閱讀版、本次五章修訂與研究歷程</w:t>
       </w:r>
     </w:p>
     <w:p>
       <w:r>
-        <w:t>58 頁五章方法修訂工作稿：分開共同檢索成效與 B 組整合品質，工程證據與正式結果分列。</w:t>
+        <w:t>59 頁五章方法修訂工作稿：分開共同檢索成效與 B 組整合品質，工程證據與正式結果分列。</w:t>
       </w:r>
     </w:p>
     <w:p>
@@ -141,7 +141,7 @@
     </w:p>
     <w:p>
       <w:r>
-        <w:t>本輪來源為 2026-10-26 方法修訂討論稿：五章全文 58 頁，原題保留，SECI 聚焦組合化；RQ1 比較共同取回，RQ2 評估 B 跨來源整合，A 回答品質不適用。Meeting 資料包會議日期待定，尚未核定；E1、E3、E4 工程驗收完成，E2 人工效力核定及正式實驗仍未完成。</w:t>
+        <w:t>本輪來源為 2026-10-26 方法修訂討論稿：老師排版五章全文 59 頁，原題保留，SECI 聚焦組合化；RQ1 比較共同取回，RQ2 評估 B 跨來源整合，A 回答品質不適用。Meeting 資料包會議日期待定，尚未核定；E1、E3、E4 工程驗收完成，E2 人工效力核定及正式實驗仍未完成。</w:t>
       </w:r>
     </w:p>
     <w:p>

</xml_diff>